<commit_message>
docs: guia de leigo (onde esta e o que cada tela faz)
</commit_message>
<xml_diff>
--- a/docs/RESUMO-SIMPLES-como-usar-29-09-2026.docx
+++ b/docs/RESUMO-SIMPLES-como-usar-29-09-2026.docx
@@ -7,27 +7,12 @@
         <w:pStyle w:val="Heading1"/>
       </w:pPr>
       <w:r>
-        <w:t>STK-CRM — O que fizemos e como usar</w:t>
+        <w:t>STK-CRM — Onde está e o que cada coisa faz</w:t>
       </w:r>
     </w:p>
     <w:p>
       <w:r>
-        <w:rPr>
-          <w:b/>
-        </w:rPr>
-        <w:t xml:space="preserve">Resumo simples dos testes de 26 a 29 de setembro de 2026. </w:t>
-      </w:r>
-      <w:r>
-        <w:t xml:space="preserve">Este é o passo a passo para o dia a dia. Se você precisar do relatório técnico completo (com ids, códigos e respostas), ele está em </w:t>
-      </w:r>
-      <w:r>
-        <w:rPr>
-          <w:i/>
-        </w:rPr>
-        <w:t>docs/relatorio-testes-26-29-set-2026.docx</w:t>
-      </w:r>
-      <w:r>
-        <w:t>.</w:t>
+        <w:t>Guia rápido, sem complicação. Primeiro você vê as telas e para que servem. Depois, o passo a passo das tarefas do dia a dia.</w:t>
       </w:r>
     </w:p>
     <w:p>
@@ -35,380 +20,7 @@
         <w:pStyle w:val="Heading2"/>
       </w:pPr>
       <w:r>
-        <w:t>1. Resumo em 5 linhas</w:t>
-      </w:r>
-    </w:p>
-    <w:p>
-      <w:pPr>
-        <w:pStyle w:val="ListBullet"/>
-      </w:pPr>
-      <w:r>
-        <w:t>Testamos tudo o que estava nas notas de atualização — os 11 itens. Tudo funcionando.</w:t>
-      </w:r>
-    </w:p>
-    <w:p>
-      <w:pPr>
-        <w:pStyle w:val="ListBullet"/>
-      </w:pPr>
-      <w:r>
-        <w:t>Consertamos 3 coisas que estavam quebradas (duas você nem tinha visto: a proposta em PDF e a badge 🔗).</w:t>
-      </w:r>
-    </w:p>
-    <w:p>
-      <w:pPr>
-        <w:pStyle w:val="ListBullet"/>
-      </w:pPr>
-      <w:r>
-        <w:t>A fila da AXS agora cria o card sozinha, com mensalidade calculada.</w:t>
-      </w:r>
-    </w:p>
-    <w:p>
-      <w:pPr>
-        <w:pStyle w:val="ListBullet"/>
-      </w:pPr>
-      <w:r>
-        <w:t>As telas ficaram mais rápidas: Atendimento saiu de mais de 2 segundos para 0,7 s; Kanban de 1,6 s para 0,8 s.</w:t>
-      </w:r>
-    </w:p>
-    <w:p>
-      <w:pPr>
-        <w:pStyle w:val="ListBullet"/>
-      </w:pPr>
-      <w:r>
-        <w:t>Base de conhecimento ficou vazia (combinado) e os números de teste continuam sendo só os dois aprovados.</w:t>
-      </w:r>
-    </w:p>
-    <w:p>
-      <w:pPr>
-        <w:pStyle w:val="Heading2"/>
-      </w:pPr>
-      <w:r>
-        <w:t>2. O que estava quebrado e já está resolvido</w:t>
-      </w:r>
-    </w:p>
-    <w:p>
-      <w:pPr>
-        <w:pStyle w:val="ListNumber"/>
-      </w:pPr>
-      <w:r>
-        <w:t>Proposta em PDF não saía — era um índice de banco com regra errada. Você rodou o SQL e voltou a funcionar. Não precisa fazer mais nada.</w:t>
-      </w:r>
-    </w:p>
-    <w:p>
-      <w:pPr>
-        <w:pStyle w:val="ListNumber"/>
-      </w:pPr>
-      <w:r>
-        <w:t>Card na AXS não era criado — eram 3 motivos nossos ao mesmo tempo: o consumo estava vazio (mínimo de 1000 kWh em cada mês), alguém tinha a AXS aberta (ela só deixa 1 login por vez) e um dado estava torto na fila. Tudo corrigido e provado com um card novo: R$ 767,88 de mensalidade.</w:t>
-      </w:r>
-    </w:p>
-    <w:p>
-      <w:pPr>
-        <w:pStyle w:val="ListNumber"/>
-      </w:pPr>
-      <w:r>
-        <w:t>Badge 🔗 STK-x não aparecia — o programa pedia uma informação no formato errado. Consertado e já está no ar: agora ela aparece ao lado do número e no topo da conversa.</w:t>
-      </w:r>
-    </w:p>
-    <w:p>
-      <w:pPr>
-        <w:pStyle w:val="ListNumber"/>
-      </w:pPr>
-      <w:r>
-        <w:t>Atenção: enquanto ninguém estiver logado na AXS, o robô cria o card sem problema. Se alguém estiver, ele falha e avisa "sessão ativa" (ainda estamos decidindo se ele aprende a derrubar essa sessão sozinho).</w:t>
-      </w:r>
-    </w:p>
-    <w:p>
-      <w:pPr>
-        <w:pStyle w:val="Heading2"/>
-      </w:pPr>
-      <w:r>
-        <w:t>3. Passo a passo do dia a dia</w:t>
-      </w:r>
-    </w:p>
-    <w:p>
-      <w:pPr>
-        <w:pStyle w:val="Heading3"/>
-      </w:pPr>
-      <w:r>
-        <w:t>Gerar e baixar a proposta em PDF</w:t>
-      </w:r>
-    </w:p>
-    <w:p>
-      <w:pPr>
-        <w:pStyle w:val="ListNumber"/>
-      </w:pPr>
-      <w:r>
-        <w:t>Abra a oportunidade no Kanban.</w:t>
-      </w:r>
-    </w:p>
-    <w:p>
-      <w:pPr>
-        <w:pStyle w:val="ListNumber"/>
-      </w:pPr>
-      <w:r>
-        <w:t>Clique em Gerar/Baixar proposta.</w:t>
-      </w:r>
-    </w:p>
-    <w:p>
-      <w:pPr>
-        <w:pStyle w:val="ListNumber"/>
-      </w:pPr>
-      <w:r>
-        <w:t>Pronto: o PDF aparece com o número da proposta e a validade de 30 dias. Se você mudar a etapa para Contrato Enviado, ele é gerado sozinho — e, se faltar alguma coisa (nome, UC, valor), ele diz o que falta e NÃO trava a etapa.</w:t>
-      </w:r>
-    </w:p>
-    <w:p>
-      <w:pPr>
-        <w:pStyle w:val="Heading3"/>
-      </w:pPr>
-      <w:r>
-        <w:t>Enviar uma proposta para a AXS (pela fila)</w:t>
-      </w:r>
-    </w:p>
-    <w:p>
-      <w:pPr>
-        <w:pStyle w:val="ListNumber"/>
-      </w:pPr>
-      <w:r>
-        <w:t>Cadastre pelo formulário AXS novo; ele enfileira em vez de disparar na hora.</w:t>
-      </w:r>
-    </w:p>
-    <w:p>
-      <w:pPr>
-        <w:pStyle w:val="ListNumber"/>
-      </w:pPr>
-      <w:r>
-        <w:t>Aparece em Fila AXS com o status Pendente.</w:t>
-      </w:r>
-    </w:p>
-    <w:p>
-      <w:pPr>
-        <w:pStyle w:val="ListNumber"/>
-      </w:pPr>
-      <w:r>
-        <w:t>O robô pega o item, cria o card e a tela vira Criada, com o número do card e a mensalidade.</w:t>
-      </w:r>
-    </w:p>
-    <w:p>
-      <w:pPr>
-        <w:pStyle w:val="ListNumber"/>
-      </w:pPr>
-      <w:r>
-        <w:t>Deu erro? A tela mostra o motivo em português e tem o botão Tentar de novo. Se o mesmo cliente já estiver na fila, o sistema avisa em vez de duplicar.</w:t>
-      </w:r>
-    </w:p>
-    <w:p>
-      <w:pPr>
-        <w:pStyle w:val="Heading3"/>
-      </w:pPr>
-      <w:r>
-        <w:t>Ver quem está esperando resposta</w:t>
-      </w:r>
-    </w:p>
-    <w:p>
-      <w:pPr>
-        <w:pStyle w:val="ListNumber"/>
-      </w:pPr>
-      <w:r>
-        <w:t>No Atendimento, clique no filtro Sem resposta.</w:t>
-      </w:r>
-    </w:p>
-    <w:p>
-      <w:pPr>
-        <w:pStyle w:val="ListNumber"/>
-      </w:pPr>
-      <w:r>
-        <w:t>A lista mostra só as conversas paradas há mais de 24h, com as horas em amarelo (ex.: 312h).</w:t>
-      </w:r>
-    </w:p>
-    <w:p>
-      <w:pPr>
-        <w:pStyle w:val="ListNumber"/>
-      </w:pPr>
-      <w:r>
-        <w:t>A mesma contagem aparece no Kanban na coluna do funil, em âmbar.</w:t>
-      </w:r>
-    </w:p>
-    <w:p>
-      <w:pPr>
-        <w:pStyle w:val="Heading3"/>
-      </w:pPr>
-      <w:r>
-        <w:t>Rodar o remarketing (retomar conversas antigas)</w:t>
-      </w:r>
-    </w:p>
-    <w:p>
-      <w:pPr>
-        <w:pStyle w:val="ListNumber"/>
-      </w:pPr>
-      <w:r>
-        <w:t>No marketing, clique em Novo Disparo.</w:t>
-      </w:r>
-    </w:p>
-    <w:p>
-      <w:pPr>
-        <w:pStyle w:val="ListNumber"/>
-      </w:pPr>
-      <w:r>
-        <w:t>Escolha a aba Remarketing.</w:t>
-      </w:r>
-    </w:p>
-    <w:p>
-      <w:pPr>
-        <w:pStyle w:val="ListNumber"/>
-      </w:pPr>
-      <w:r>
-        <w:t>Ele mostra quantas conversas serão retomadas (ex.: 15) e o botão Criar Disparo (15 contatos).</w:t>
-      </w:r>
-    </w:p>
-    <w:p>
-      <w:pPr>
-        <w:pStyle w:val="ListNumber"/>
-      </w:pPr>
-      <w:r>
-        <w:t>Só crie quando quiser de fato — hoje o robô está em modo ensaio e não envia nada por conta própria.</w:t>
-      </w:r>
-    </w:p>
-    <w:p>
-      <w:pPr>
-        <w:pStyle w:val="Heading3"/>
-      </w:pPr>
-      <w:r>
-        <w:t>Conferir os avisos (sino)</w:t>
-      </w:r>
-    </w:p>
-    <w:p>
-      <w:pPr>
-        <w:pStyle w:val="ListNumber"/>
-      </w:pPr>
-      <w:r>
-        <w:t>Clique no sino no topo.</w:t>
-      </w:r>
-    </w:p>
-    <w:p>
-      <w:pPr>
-        <w:pStyle w:val="ListNumber"/>
-      </w:pPr>
-      <w:r>
-        <w:t>A lista abre com os avisos. Avisos de oportunidade parada aparecem quando o robô detecta algo parado há mais de 72h (no ensaio ele só calcula, não avisa de verdade).</w:t>
-      </w:r>
-    </w:p>
-    <w:p>
-      <w:pPr>
-        <w:pStyle w:val="Heading3"/>
-      </w:pPr>
-      <w:r>
-        <w:t>Ensinar a IA (base de conhecimento)</w:t>
-      </w:r>
-    </w:p>
-    <w:p>
-      <w:pPr>
-        <w:pStyle w:val="ListNumber"/>
-      </w:pPr>
-      <w:r>
-        <w:t>Configurações → Base de Conhecimento.</w:t>
-      </w:r>
-    </w:p>
-    <w:p>
-      <w:pPr>
-        <w:pStyle w:val="ListNumber"/>
-      </w:pPr>
-      <w:r>
-        <w:t>Preencha categoria, pergunta, resposta e palavras-chave, e clique em Adicionar à base.</w:t>
-      </w:r>
-    </w:p>
-    <w:p>
-      <w:pPr>
-        <w:pStyle w:val="ListNumber"/>
-      </w:pPr>
-      <w:r>
-        <w:t>Para mudar: clique no lápis, edite e Salvar alterações. Para desligar uma entrada: use o interruptor. Para apagar: a lixeira.</w:t>
-      </w:r>
-    </w:p>
-    <w:p>
-      <w:pPr>
-        <w:pStyle w:val="ListNumber"/>
-      </w:pPr>
-      <w:r>
-        <w:t>Importante: com a base vazia (que é como ficou), a IA encaminha tudo para o vendedor e não inventa resposta.</w:t>
-      </w:r>
-    </w:p>
-    <w:p>
-      <w:pPr>
-        <w:pStyle w:val="Heading3"/>
-      </w:pPr>
-      <w:r>
-        <w:t>O que significa a badge 🔗 STK-x</w:t>
-      </w:r>
-    </w:p>
-    <w:p>
-      <w:r>
-        <w:t>Quando o número do cliente também é um WhatsApp conectado no sistema, aparece 🔗 STK-1, STK-2 ou STK-3 ao lado do número — na lista e no topo da conversa. Ela avisa que a mensagem existe dos dois lados: o que você enviar de um lado aparece recebido do outro. Não é mensagem duplicada, é conversa espelhada.</w:t>
-      </w:r>
-    </w:p>
-    <w:p>
-      <w:pPr>
-        <w:pStyle w:val="Heading3"/>
-      </w:pPr>
-      <w:r>
-        <w:t>Ligar e desligar o robô</w:t>
-      </w:r>
-    </w:p>
-    <w:p>
-      <w:pPr>
-        <w:pStyle w:val="ListBullet"/>
-      </w:pPr>
-      <w:r>
-        <w:t>Ligar: /app/start-worker.sh</w:t>
-      </w:r>
-    </w:p>
-    <w:p>
-      <w:pPr>
-        <w:pStyle w:val="ListBullet"/>
-      </w:pPr>
-      <w:r>
-        <w:t>Desligar: /app/stop-worker.sh</w:t>
-      </w:r>
-    </w:p>
-    <w:p>
-      <w:pPr>
-        <w:pStyle w:val="ListBullet"/>
-      </w:pPr>
-      <w:r>
-        <w:t>O log fica em tempo real — é por lá que se vê o robô trabalhando.</w:t>
-      </w:r>
-    </w:p>
-    <w:p>
-      <w:pPr>
-        <w:pStyle w:val="Heading3"/>
-      </w:pPr>
-      <w:r>
-        <w:t>Testar imagem e documento no chat</w:t>
-      </w:r>
-    </w:p>
-    <w:p>
-      <w:pPr>
-        <w:pStyle w:val="ListNumber"/>
-      </w:pPr>
-      <w:r>
-        <w:t>Clique na foto: ela abre em tela cheia, com o botão Fechar.</w:t>
-      </w:r>
-    </w:p>
-    <w:p>
-      <w:pPr>
-        <w:pStyle w:val="ListNumber"/>
-      </w:pPr>
-      <w:r>
-        <w:t>Clique no arquivo: baixa com o nome certo (testamos com um xlsx de 13.781 bytes).</w:t>
-      </w:r>
-    </w:p>
-    <w:p>
-      <w:pPr>
-        <w:pStyle w:val="Heading2"/>
-      </w:pPr>
-      <w:r>
-        <w:t>4. Velocidade — antes e depois</w:t>
+        <w:t>1. As telas do programa</w:t>
       </w:r>
     </w:p>
     <w:tbl>
@@ -445,7 +57,7 @@
               <w:rPr>
                 <w:b/>
               </w:rPr>
-              <w:t>Antes</w:t>
+              <w:t>Onde você encontra</w:t>
             </w:r>
           </w:p>
         </w:tc>
@@ -458,7 +70,7 @@
               <w:rPr>
                 <w:b/>
               </w:rPr>
-              <w:t>Depois</w:t>
+              <w:t>O que você faz lá</w:t>
             </w:r>
           </w:p>
         </w:tc>
@@ -480,7 +92,7 @@
           </w:tcPr>
           <w:p>
             <w:r>
-              <w:t>1,8 a 2,0 s</w:t>
+              <w:t>Clique em Atendimento (menu da esquerda)</w:t>
             </w:r>
           </w:p>
         </w:tc>
@@ -490,7 +102,7 @@
           </w:tcPr>
           <w:p>
             <w:r>
-              <w:t>0,7 s</w:t>
+              <w:t>Vê as conversas de WhatsApp e responde o cliente</w:t>
             </w:r>
           </w:p>
         </w:tc>
@@ -502,7 +114,7 @@
           </w:tcPr>
           <w:p>
             <w:r>
-              <w:t>Kanban</w:t>
+              <w:t>Oportunidades (Kanban)</w:t>
             </w:r>
           </w:p>
         </w:tc>
@@ -512,7 +124,7 @@
           </w:tcPr>
           <w:p>
             <w:r>
-              <w:t>1,6 s</w:t>
+              <w:t>Clique em Oportunidades</w:t>
             </w:r>
           </w:p>
         </w:tc>
@@ -522,7 +134,7 @@
           </w:tcPr>
           <w:p>
             <w:r>
-              <w:t>0,8 s</w:t>
+              <w:t>Vê cada cliente arrastado por etapa, do começo ao fim</w:t>
             </w:r>
           </w:p>
         </w:tc>
@@ -534,7 +146,7 @@
           </w:tcPr>
           <w:p>
             <w:r>
-              <w:t>Campanhas (Marketing)</w:t>
+              <w:t>Painel</w:t>
             </w:r>
           </w:p>
         </w:tc>
@@ -544,7 +156,7 @@
           </w:tcPr>
           <w:p>
             <w:r>
-              <w:t>28,6 MB e até 12 s</w:t>
+              <w:t>Clique em Dashboard</w:t>
             </w:r>
           </w:p>
         </w:tc>
@@ -554,7 +166,7 @@
           </w:tcPr>
           <w:p>
             <w:r>
-              <w:t>142 KB em 0,4 s</w:t>
+              <w:t>Vê o resumo do dia: vendas e meta</w:t>
             </w:r>
           </w:p>
         </w:tc>
@@ -566,7 +178,7 @@
           </w:tcPr>
           <w:p>
             <w:r>
-              <w:t>Dashboard</w:t>
+              <w:t>Clientes</w:t>
             </w:r>
           </w:p>
         </w:tc>
@@ -576,7 +188,7 @@
           </w:tcPr>
           <w:p>
             <w:r>
-              <w:t>0,7 s</w:t>
+              <w:t>Clique em Clientes</w:t>
             </w:r>
           </w:p>
         </w:tc>
@@ -586,15 +198,447 @@
           </w:tcPr>
           <w:p>
             <w:r>
-              <w:t>0,7 s (mantido)</w:t>
+              <w:t>Cadastra e procura clientes</w:t>
+            </w:r>
+          </w:p>
+        </w:tc>
+      </w:tr>
+      <w:tr>
+        <w:tc>
+          <w:tcPr>
+            <w:tcW w:type="dxa" w:w="2880"/>
+          </w:tcPr>
+          <w:p>
+            <w:r>
+              <w:t>Disparo</w:t>
+            </w:r>
+          </w:p>
+        </w:tc>
+        <w:tc>
+          <w:tcPr>
+            <w:tcW w:type="dxa" w:w="2880"/>
+          </w:tcPr>
+          <w:p>
+            <w:r>
+              <w:t>Clique em Marketing e depois em Disparo</w:t>
+            </w:r>
+          </w:p>
+        </w:tc>
+        <w:tc>
+          <w:tcPr>
+            <w:tcW w:type="dxa" w:w="2880"/>
+          </w:tcPr>
+          <w:p>
+            <w:r>
+              <w:t>Prepara mensagens para várias pessoas ao mesmo tempo</w:t>
+            </w:r>
+          </w:p>
+        </w:tc>
+      </w:tr>
+      <w:tr>
+        <w:tc>
+          <w:tcPr>
+            <w:tcW w:type="dxa" w:w="2880"/>
+          </w:tcPr>
+          <w:p>
+            <w:r>
+              <w:t>Fila AXS</w:t>
+            </w:r>
+          </w:p>
+        </w:tc>
+        <w:tc>
+          <w:tcPr>
+            <w:tcW w:type="dxa" w:w="2880"/>
+          </w:tcPr>
+          <w:p>
+            <w:r>
+              <w:t>Clique em Fila AXS</w:t>
+            </w:r>
+          </w:p>
+        </w:tc>
+        <w:tc>
+          <w:tcPr>
+            <w:tcW w:type="dxa" w:w="2880"/>
+          </w:tcPr>
+          <w:p>
+            <w:r>
+              <w:t>Vê as propostas que você mandou para a AXS e em que situação cada uma está</w:t>
+            </w:r>
+          </w:p>
+        </w:tc>
+      </w:tr>
+      <w:tr>
+        <w:tc>
+          <w:tcPr>
+            <w:tcW w:type="dxa" w:w="2880"/>
+          </w:tcPr>
+          <w:p>
+            <w:r>
+              <w:t>Avisos</w:t>
+            </w:r>
+          </w:p>
+        </w:tc>
+        <w:tc>
+          <w:tcPr>
+            <w:tcW w:type="dxa" w:w="2880"/>
+          </w:tcPr>
+          <w:p>
+            <w:r>
+              <w:t>O sino, no canto de cima da tela</w:t>
+            </w:r>
+          </w:p>
+        </w:tc>
+        <w:tc>
+          <w:tcPr>
+            <w:tcW w:type="dxa" w:w="2880"/>
+          </w:tcPr>
+          <w:p>
+            <w:r>
+              <w:t>Mostra os recados dirigidos a você</w:t>
+            </w:r>
+          </w:p>
+        </w:tc>
+      </w:tr>
+      <w:tr>
+        <w:tc>
+          <w:tcPr>
+            <w:tcW w:type="dxa" w:w="2880"/>
+          </w:tcPr>
+          <w:p>
+            <w:r>
+              <w:t>Ensinar a IA</w:t>
+            </w:r>
+          </w:p>
+        </w:tc>
+        <w:tc>
+          <w:tcPr>
+            <w:tcW w:type="dxa" w:w="2880"/>
+          </w:tcPr>
+          <w:p>
+            <w:r>
+              <w:t>Configurações e depois Base de Conhecimento</w:t>
+            </w:r>
+          </w:p>
+        </w:tc>
+        <w:tc>
+          <w:tcPr>
+            <w:tcW w:type="dxa" w:w="2880"/>
+          </w:tcPr>
+          <w:p>
+            <w:r>
+              <w:t>Escreve o que a IA pode responder ao cliente</w:t>
+            </w:r>
+          </w:p>
+        </w:tc>
+      </w:tr>
+      <w:tr>
+        <w:tc>
+          <w:tcPr>
+            <w:tcW w:type="dxa" w:w="2880"/>
+          </w:tcPr>
+          <w:p>
+            <w:r>
+              <w:t>O robô</w:t>
+            </w:r>
+          </w:p>
+        </w:tc>
+        <w:tc>
+          <w:tcPr>
+            <w:tcW w:type="dxa" w:w="2880"/>
+          </w:tcPr>
+          <w:p>
+            <w:r>
+              <w:t>Não tem tela — ele trabalha sozinho</w:t>
+            </w:r>
+          </w:p>
+        </w:tc>
+        <w:tc>
+          <w:tcPr>
+            <w:tcW w:type="dxa" w:w="2880"/>
+          </w:tcPr>
+          <w:p>
+            <w:r>
+              <w:t>Faz os trabalhos automáticos: avisa oportunidade parada, prepara o remarketing e manda as propostas para a AXS</w:t>
             </w:r>
           </w:p>
         </w:tc>
       </w:tr>
     </w:tbl>
     <w:p>
+      <w:pPr>
+        <w:pStyle w:val="Heading2"/>
+      </w:pPr>
       <w:r>
-        <w:t>O que mais pesava: um arquivo de imagens guardado dentro do banco (28 MB) e chamadas duplicadas na abertura da tela. Os dois estão corrigidos.</w:t>
+        <w:t>2. Passo a passo das tarefas do dia a dia</w:t>
+      </w:r>
+    </w:p>
+    <w:p>
+      <w:pPr>
+        <w:pStyle w:val="Heading3"/>
+      </w:pPr>
+      <w:r>
+        <w:t>Ver quem está esperando você responder</w:t>
+      </w:r>
+    </w:p>
+    <w:p>
+      <w:pPr>
+        <w:pStyle w:val="ListNumber"/>
+      </w:pPr>
+      <w:r>
+        <w:t>Abra Atendimento.</w:t>
+      </w:r>
+    </w:p>
+    <w:p>
+      <w:pPr>
+        <w:pStyle w:val="ListNumber"/>
+      </w:pPr>
+      <w:r>
+        <w:t>Clique no filtro Sem resposta, em cima da lista.</w:t>
+      </w:r>
+    </w:p>
+    <w:p>
+      <w:pPr>
+        <w:pStyle w:val="ListNumber"/>
+      </w:pPr>
+      <w:r>
+        <w:t>A lista mostra só as conversas paradas, com as horas em amarelo. É só escolher uma e responder.</w:t>
+      </w:r>
+    </w:p>
+    <w:p>
+      <w:pPr>
+        <w:pStyle w:val="Heading3"/>
+      </w:pPr>
+      <w:r>
+        <w:t>Gerar a proposta em PDF</w:t>
+      </w:r>
+    </w:p>
+    <w:p>
+      <w:pPr>
+        <w:pStyle w:val="ListNumber"/>
+      </w:pPr>
+      <w:r>
+        <w:t>Abra o Kanban e clique no cartão do cliente.</w:t>
+      </w:r>
+    </w:p>
+    <w:p>
+      <w:pPr>
+        <w:pStyle w:val="ListNumber"/>
+      </w:pPr>
+      <w:r>
+        <w:t>Clique em Gerar/Baixar proposta.</w:t>
+      </w:r>
+    </w:p>
+    <w:p>
+      <w:pPr>
+        <w:pStyle w:val="ListNumber"/>
+      </w:pPr>
+      <w:r>
+        <w:t>O PDF aparece com o número da proposta e vale 30 dias. Se algo faltar (nome, UC ou valor), a tela avisa o que falta e não trava — é só completar e gerar de novo.</w:t>
+      </w:r>
+    </w:p>
+    <w:p>
+      <w:pPr>
+        <w:pStyle w:val="Heading3"/>
+      </w:pPr>
+      <w:r>
+        <w:t>Mandar a proposta para a AXS</w:t>
+      </w:r>
+    </w:p>
+    <w:p>
+      <w:pPr>
+        <w:pStyle w:val="ListNumber"/>
+      </w:pPr>
+      <w:r>
+        <w:t>Na pasta do cliente, use o formulário AXS novo e envie.</w:t>
+      </w:r>
+    </w:p>
+    <w:p>
+      <w:pPr>
+        <w:pStyle w:val="ListNumber"/>
+      </w:pPr>
+      <w:r>
+        <w:t>A proposta entra na fila e aparece em Fila AXS como Pendente.</w:t>
+      </w:r>
+    </w:p>
+    <w:p>
+      <w:pPr>
+        <w:pStyle w:val="ListNumber"/>
+      </w:pPr>
+      <w:r>
+        <w:t>O robô pega e cria o card na AXS; aí a tela vira Criada, com a mensalidade ao lado.</w:t>
+      </w:r>
+    </w:p>
+    <w:p>
+      <w:pPr>
+        <w:pStyle w:val="ListNumber"/>
+      </w:pPr>
+      <w:r>
+        <w:t>Deu erro? O motivo aparece escrito em português e existe o botão Tentar de novo. Se o mesmo cliente já estiver na fila, o sistema avisa em vez de criar em duplicidade.</w:t>
+      </w:r>
+    </w:p>
+    <w:p>
+      <w:pPr>
+        <w:pStyle w:val="Heading3"/>
+      </w:pPr>
+      <w:r>
+        <w:t>Criar um disparo</w:t>
+      </w:r>
+    </w:p>
+    <w:p>
+      <w:pPr>
+        <w:pStyle w:val="ListNumber"/>
+      </w:pPr>
+      <w:r>
+        <w:t>Abra Marketing e clique em Novo Disparo.</w:t>
+      </w:r>
+    </w:p>
+    <w:p>
+      <w:pPr>
+        <w:pStyle w:val="ListNumber"/>
+      </w:pPr>
+      <w:r>
+        <w:t>Escolha o tipo: Avulso (lista montada), Em Massa ou Remarketing.</w:t>
+      </w:r>
+    </w:p>
+    <w:p>
+      <w:pPr>
+        <w:pStyle w:val="ListNumber"/>
+      </w:pPr>
+      <w:r>
+        <w:t>No Remarketing, a própria tela diz quantas conversas serão retomadas (ex.: 15) e mostra o botão Criar Disparo.</w:t>
+      </w:r>
+    </w:p>
+    <w:p>
+      <w:pPr>
+        <w:pStyle w:val="Heading3"/>
+      </w:pPr>
+      <w:r>
+        <w:t>Ver os avisos</w:t>
+      </w:r>
+    </w:p>
+    <w:p>
+      <w:pPr>
+        <w:pStyle w:val="ListNumber"/>
+      </w:pPr>
+      <w:r>
+        <w:t>Clique no sino, no canto de cima.</w:t>
+      </w:r>
+    </w:p>
+    <w:p>
+      <w:pPr>
+        <w:pStyle w:val="ListNumber"/>
+      </w:pPr>
+      <w:r>
+        <w:t>Se aparecer um aviso de oportunidade parada, é porque o cliente está parado há 3 dias.</w:t>
+      </w:r>
+    </w:p>
+    <w:p>
+      <w:pPr>
+        <w:pStyle w:val="Heading3"/>
+      </w:pPr>
+      <w:r>
+        <w:t>Ensinando a IA o que responder</w:t>
+      </w:r>
+    </w:p>
+    <w:p>
+      <w:pPr>
+        <w:pStyle w:val="ListNumber"/>
+      </w:pPr>
+      <w:r>
+        <w:t>Vá em Configurações e depois Base de Conhecimento.</w:t>
+      </w:r>
+    </w:p>
+    <w:p>
+      <w:pPr>
+        <w:pStyle w:val="ListNumber"/>
+      </w:pPr>
+      <w:r>
+        <w:t>Escreva a categoria, a pergunta do cliente, a resposta e as palavras-chave. Clique em Adicionar à base.</w:t>
+      </w:r>
+    </w:p>
+    <w:p>
+      <w:pPr>
+        <w:pStyle w:val="ListNumber"/>
+      </w:pPr>
+      <w:r>
+        <w:t>Para mudar uma resposta: clique no lápis. Para pausar: use o interruptor. Para apagar: a lixeira.</w:t>
+      </w:r>
+    </w:p>
+    <w:p>
+      <w:pPr>
+        <w:pStyle w:val="ListNumber"/>
+      </w:pPr>
+      <w:r>
+        <w:t>Com a base vazia (que é como ficou depois do teste), a IA não inventa nada — ela chama o vendedor.</w:t>
+      </w:r>
+    </w:p>
+    <w:p>
+      <w:pPr>
+        <w:pStyle w:val="Heading3"/>
+      </w:pPr>
+      <w:r>
+        <w:t>Abrir uma foto ou baixar um arquivo na conversa</w:t>
+      </w:r>
+    </w:p>
+    <w:p>
+      <w:pPr>
+        <w:pStyle w:val="ListNumber"/>
+      </w:pPr>
+      <w:r>
+        <w:t>Na conversa, clique na foto: ela abre em tela cheia e você fecha com o botão Fechar.</w:t>
+      </w:r>
+    </w:p>
+    <w:p>
+      <w:pPr>
+        <w:pStyle w:val="ListNumber"/>
+      </w:pPr>
+      <w:r>
+        <w:t>Clique no arquivo: ele baixa para o seu computador com o nome certo.</w:t>
+      </w:r>
+    </w:p>
+    <w:p>
+      <w:pPr>
+        <w:pStyle w:val="Heading3"/>
+      </w:pPr>
+      <w:r>
+        <w:t>O que é o 🔗 STK-1, STK-2, STK-3</w:t>
+      </w:r>
+    </w:p>
+    <w:p>
+      <w:r>
+        <w:t>Aparece ao lado do número do cliente quando esse número também é um WhatsApp do sistema. Aí a mensagem existe dos dois lados: o que você manda de um lado aparece recebido do outro. É conversa espelhada, não é mensagem duplicada.</w:t>
+      </w:r>
+    </w:p>
+    <w:p>
+      <w:pPr>
+        <w:pStyle w:val="Heading3"/>
+      </w:pPr>
+      <w:r>
+        <w:t>Ligar e desligar o robô</w:t>
+      </w:r>
+    </w:p>
+    <w:p>
+      <w:pPr>
+        <w:pStyle w:val="ListBullet"/>
+      </w:pPr>
+      <w:r>
+        <w:t>Ligar: /app/start-worker.sh</w:t>
+      </w:r>
+    </w:p>
+    <w:p>
+      <w:pPr>
+        <w:pStyle w:val="ListBullet"/>
+      </w:pPr>
+      <w:r>
+        <w:t>Desligar: /app/stop-worker.sh</w:t>
+      </w:r>
+    </w:p>
+    <w:p>
+      <w:pPr>
+        <w:pStyle w:val="ListBullet"/>
+      </w:pPr>
+      <w:r>
+        <w:t>Ele hoje trabalha em modo de ensaio, ou seja, só calcula e avisa — não dispara nada sozinho.</w:t>
       </w:r>
     </w:p>
     <w:p>
@@ -602,7 +646,7 @@
         <w:pStyle w:val="Heading2"/>
       </w:pPr>
       <w:r>
-        <w:t>5. Ainda depende de você (lista curta)</w:t>
+        <w:t>3. O que já consertamos (você não precisa fazer nada)</w:t>
       </w:r>
     </w:p>
     <w:p>
@@ -610,7 +654,7 @@
         <w:pStyle w:val="ListNumber"/>
       </w:pPr>
       <w:r>
-        <w:t>Conferir os 3 índices do SQL 089 (opcional): SELECT indexname FROM pg_indexes WHERE indexname LIKE 'idx_%sem_resposta%' OR indexname IN ('idx_notificacoes_tipo_criada','idx_oportunidades_etapa_updated'); — deve voltar 3 linhas.</w:t>
+        <w:t>A proposta em PDF voltou a funcionar depois que você colou o código que eu te mandei no painel.</w:t>
       </w:r>
     </w:p>
     <w:p>
@@ -618,7 +662,7 @@
         <w:pStyle w:val="ListNumber"/>
       </w:pPr>
       <w:r>
-        <w:t>Decidir se o robô aprende a se liberar sozinho quando a AXS estiver com alguém logado.</w:t>
+        <w:t>A AXS volta a criar o card sozinho, com a mensalidade. Só evite estar com a AXS aberta no navegador na hora — se estiver, o robô avisa sessão ativa e tenta depois.</w:t>
       </w:r>
     </w:p>
     <w:p>
@@ -626,7 +670,7 @@
         <w:pStyle w:val="ListNumber"/>
       </w:pPr>
       <w:r>
-        <w:t>Decidir se a fila valida consumo/UC/CEP antes de aceitar (para não enfileirar dado incompleto).</w:t>
+        <w:t>A sigla 🔗 agora aparece ao lado do número e no topo da conversa.</w:t>
       </w:r>
     </w:p>
     <w:p>
@@ -634,7 +678,7 @@
         <w:pStyle w:val="ListNumber"/>
       </w:pPr>
       <w:r>
-        <w:t>Se quiser: consertar os 2 acessibilidade (sino e botões da base sem nome para leitor de tela) — são detalhes pequenos.</w:t>
+        <w:t>Base de conhecimento ficou vazia, como você pediu.</w:t>
       </w:r>
     </w:p>
     <w:p>
@@ -642,7 +686,39 @@
         <w:pStyle w:val="Heading2"/>
       </w:pPr>
       <w:r>
-        <w:t>6. Onde achar os detalhes</w:t>
+        <w:t>4. O que ficou para depois</w:t>
+      </w:r>
+    </w:p>
+    <w:p>
+      <w:pPr>
+        <w:pStyle w:val="ListNumber"/>
+      </w:pPr>
+      <w:r>
+        <w:t>Duas decisões: fazer o robô se liberar sozinho quando a AXS estiver ocupada, e ele recusar proposta incompleta antes de entrar na fila.</w:t>
+      </w:r>
+    </w:p>
+    <w:p>
+      <w:pPr>
+        <w:pStyle w:val="ListNumber"/>
+      </w:pPr>
+      <w:r>
+        <w:t>Se quiser, me peça para confirmar que aquele código que você colou no painel teve efeito.</w:t>
+      </w:r>
+    </w:p>
+    <w:p>
+      <w:pPr>
+        <w:pStyle w:val="ListNumber"/>
+      </w:pPr>
+      <w:r>
+        <w:t>Dois detalhes pequenos de acessibilidade (o sino e os botões da base não têm nome para leitor de tela).</w:t>
+      </w:r>
+    </w:p>
+    <w:p>
+      <w:pPr>
+        <w:pStyle w:val="Heading2"/>
+      </w:pPr>
+      <w:r>
+        <w:t>5. Onde achar mais</w:t>
       </w:r>
     </w:p>
     <w:p>
@@ -650,7 +726,7 @@
         <w:pStyle w:val="ListBullet"/>
       </w:pPr>
       <w:r>
-        <w:t>docs/relatorio-testes-26-29-set-2026.docx — relatório técnico completo.</w:t>
+        <w:t>relatorio-testes-26-29-set-2026.docx — relatório técnico completo, com todas as provas.</w:t>
       </w:r>
     </w:p>
     <w:p>
@@ -658,7 +734,7 @@
         <w:pStyle w:val="ListBullet"/>
       </w:pPr>
       <w:r>
-        <w:t>docs/TESTES-SISTEMA.MD — log vivo, atualizado a cada teste.</w:t>
+        <w:t>PARECER-ARP-28-09-2026.md — a explicação de por que a AXS parou de criar card.</w:t>
       </w:r>
     </w:p>
     <w:p>
@@ -666,15 +742,7 @@
         <w:pStyle w:val="ListBullet"/>
       </w:pPr>
       <w:r>
-        <w:t>docs/PARECER-ARP-28-09-2026.md — por que a AXS parou de criar card e o que resolvemos.</w:t>
-      </w:r>
-    </w:p>
-    <w:p>
-      <w:pPr>
-        <w:pStyle w:val="ListBullet"/>
-      </w:pPr>
-      <w:r>
-        <w:t>docs/HANDOFF.md — por onde toda sessão de trabalho começa.</w:t>
+        <w:t>TESTES-SISTEMA.MD — o registro de todos os testes, atualizado a cada um.</w:t>
       </w:r>
     </w:p>
     <w:sectPr>
@@ -695,7 +763,7 @@
       <w:pStyle w:val="Footer"/>
     </w:pPr>
     <w:r>
-      <w:t>STK-CRM — resumo simples do que fizemos e como usar · 26–29/09/2026</w:t>
+      <w:t>STK-CRM — guia rápido (onde está e o que faz) · setembro de 2026</w:t>
     </w:r>
   </w:p>
 </w:ftr>

</xml_diff>

<commit_message>
docs: atualiza Word (sincronia S-01/S-02) e CHANGELOG 1.8.0
</commit_message>
<xml_diff>
--- a/docs/RESUMO-SIMPLES-como-usar-29-09-2026.docx
+++ b/docs/RESUMO-SIMPLES-como-usar-29-09-2026.docx
@@ -30,14 +30,14 @@
         <w:tblLook w:firstColumn="1" w:firstRow="1" w:lastColumn="0" w:lastRow="0" w:noHBand="0" w:noVBand="1" w:val="04A0"/>
       </w:tblPr>
       <w:tblGrid>
-        <w:gridCol w:w="2880"/>
-        <w:gridCol w:w="2880"/>
-        <w:gridCol w:w="2880"/>
+        <w:gridCol w:w="2873"/>
+        <w:gridCol w:w="2873"/>
+        <w:gridCol w:w="2873"/>
       </w:tblGrid>
       <w:tr>
         <w:tc>
           <w:tcPr>
-            <w:tcW w:type="dxa" w:w="2880"/>
+            <w:tcW w:type="dxa" w:w="2873"/>
           </w:tcPr>
           <w:p>
             <w:r>
@@ -50,7 +50,7 @@
         </w:tc>
         <w:tc>
           <w:tcPr>
-            <w:tcW w:type="dxa" w:w="2880"/>
+            <w:tcW w:type="dxa" w:w="2873"/>
           </w:tcPr>
           <w:p>
             <w:r>
@@ -63,7 +63,7 @@
         </w:tc>
         <w:tc>
           <w:tcPr>
-            <w:tcW w:type="dxa" w:w="2880"/>
+            <w:tcW w:type="dxa" w:w="2873"/>
           </w:tcPr>
           <w:p>
             <w:r>
@@ -78,7 +78,7 @@
       <w:tr>
         <w:tc>
           <w:tcPr>
-            <w:tcW w:type="dxa" w:w="2880"/>
+            <w:tcW w:type="dxa" w:w="2873"/>
           </w:tcPr>
           <w:p>
             <w:r>
@@ -88,7 +88,7 @@
         </w:tc>
         <w:tc>
           <w:tcPr>
-            <w:tcW w:type="dxa" w:w="2880"/>
+            <w:tcW w:type="dxa" w:w="2873"/>
           </w:tcPr>
           <w:p>
             <w:r>
@@ -98,7 +98,7 @@
         </w:tc>
         <w:tc>
           <w:tcPr>
-            <w:tcW w:type="dxa" w:w="2880"/>
+            <w:tcW w:type="dxa" w:w="2873"/>
           </w:tcPr>
           <w:p>
             <w:r>
@@ -110,7 +110,7 @@
       <w:tr>
         <w:tc>
           <w:tcPr>
-            <w:tcW w:type="dxa" w:w="2880"/>
+            <w:tcW w:type="dxa" w:w="2873"/>
           </w:tcPr>
           <w:p>
             <w:r>
@@ -120,7 +120,7 @@
         </w:tc>
         <w:tc>
           <w:tcPr>
-            <w:tcW w:type="dxa" w:w="2880"/>
+            <w:tcW w:type="dxa" w:w="2873"/>
           </w:tcPr>
           <w:p>
             <w:r>
@@ -130,7 +130,7 @@
         </w:tc>
         <w:tc>
           <w:tcPr>
-            <w:tcW w:type="dxa" w:w="2880"/>
+            <w:tcW w:type="dxa" w:w="2873"/>
           </w:tcPr>
           <w:p>
             <w:r>
@@ -142,7 +142,7 @@
       <w:tr>
         <w:tc>
           <w:tcPr>
-            <w:tcW w:type="dxa" w:w="2880"/>
+            <w:tcW w:type="dxa" w:w="2873"/>
           </w:tcPr>
           <w:p>
             <w:r>
@@ -152,7 +152,7 @@
         </w:tc>
         <w:tc>
           <w:tcPr>
-            <w:tcW w:type="dxa" w:w="2880"/>
+            <w:tcW w:type="dxa" w:w="2873"/>
           </w:tcPr>
           <w:p>
             <w:r>
@@ -162,7 +162,7 @@
         </w:tc>
         <w:tc>
           <w:tcPr>
-            <w:tcW w:type="dxa" w:w="2880"/>
+            <w:tcW w:type="dxa" w:w="2873"/>
           </w:tcPr>
           <w:p>
             <w:r>
@@ -174,7 +174,7 @@
       <w:tr>
         <w:tc>
           <w:tcPr>
-            <w:tcW w:type="dxa" w:w="2880"/>
+            <w:tcW w:type="dxa" w:w="2873"/>
           </w:tcPr>
           <w:p>
             <w:r>
@@ -184,7 +184,7 @@
         </w:tc>
         <w:tc>
           <w:tcPr>
-            <w:tcW w:type="dxa" w:w="2880"/>
+            <w:tcW w:type="dxa" w:w="2873"/>
           </w:tcPr>
           <w:p>
             <w:r>
@@ -194,7 +194,7 @@
         </w:tc>
         <w:tc>
           <w:tcPr>
-            <w:tcW w:type="dxa" w:w="2880"/>
+            <w:tcW w:type="dxa" w:w="2873"/>
           </w:tcPr>
           <w:p>
             <w:r>
@@ -206,7 +206,7 @@
       <w:tr>
         <w:tc>
           <w:tcPr>
-            <w:tcW w:type="dxa" w:w="2880"/>
+            <w:tcW w:type="dxa" w:w="2873"/>
           </w:tcPr>
           <w:p>
             <w:r>
@@ -216,7 +216,7 @@
         </w:tc>
         <w:tc>
           <w:tcPr>
-            <w:tcW w:type="dxa" w:w="2880"/>
+            <w:tcW w:type="dxa" w:w="2873"/>
           </w:tcPr>
           <w:p>
             <w:r>
@@ -226,7 +226,7 @@
         </w:tc>
         <w:tc>
           <w:tcPr>
-            <w:tcW w:type="dxa" w:w="2880"/>
+            <w:tcW w:type="dxa" w:w="2873"/>
           </w:tcPr>
           <w:p>
             <w:r>
@@ -238,7 +238,7 @@
       <w:tr>
         <w:tc>
           <w:tcPr>
-            <w:tcW w:type="dxa" w:w="2880"/>
+            <w:tcW w:type="dxa" w:w="2873"/>
           </w:tcPr>
           <w:p>
             <w:r>
@@ -248,7 +248,7 @@
         </w:tc>
         <w:tc>
           <w:tcPr>
-            <w:tcW w:type="dxa" w:w="2880"/>
+            <w:tcW w:type="dxa" w:w="2873"/>
           </w:tcPr>
           <w:p>
             <w:r>
@@ -258,7 +258,7 @@
         </w:tc>
         <w:tc>
           <w:tcPr>
-            <w:tcW w:type="dxa" w:w="2880"/>
+            <w:tcW w:type="dxa" w:w="2873"/>
           </w:tcPr>
           <w:p>
             <w:r>
@@ -270,7 +270,7 @@
       <w:tr>
         <w:tc>
           <w:tcPr>
-            <w:tcW w:type="dxa" w:w="2880"/>
+            <w:tcW w:type="dxa" w:w="2873"/>
           </w:tcPr>
           <w:p>
             <w:r>
@@ -280,7 +280,7 @@
         </w:tc>
         <w:tc>
           <w:tcPr>
-            <w:tcW w:type="dxa" w:w="2880"/>
+            <w:tcW w:type="dxa" w:w="2873"/>
           </w:tcPr>
           <w:p>
             <w:r>
@@ -290,7 +290,7 @@
         </w:tc>
         <w:tc>
           <w:tcPr>
-            <w:tcW w:type="dxa" w:w="2880"/>
+            <w:tcW w:type="dxa" w:w="2873"/>
           </w:tcPr>
           <w:p>
             <w:r>
@@ -302,7 +302,7 @@
       <w:tr>
         <w:tc>
           <w:tcPr>
-            <w:tcW w:type="dxa" w:w="2880"/>
+            <w:tcW w:type="dxa" w:w="2873"/>
           </w:tcPr>
           <w:p>
             <w:r>
@@ -312,7 +312,7 @@
         </w:tc>
         <w:tc>
           <w:tcPr>
-            <w:tcW w:type="dxa" w:w="2880"/>
+            <w:tcW w:type="dxa" w:w="2873"/>
           </w:tcPr>
           <w:p>
             <w:r>
@@ -322,7 +322,7 @@
         </w:tc>
         <w:tc>
           <w:tcPr>
-            <w:tcW w:type="dxa" w:w="2880"/>
+            <w:tcW w:type="dxa" w:w="2873"/>
           </w:tcPr>
           <w:p>
             <w:r>
@@ -334,7 +334,7 @@
       <w:tr>
         <w:tc>
           <w:tcPr>
-            <w:tcW w:type="dxa" w:w="2880"/>
+            <w:tcW w:type="dxa" w:w="2873"/>
           </w:tcPr>
           <w:p>
             <w:r>
@@ -344,7 +344,7 @@
         </w:tc>
         <w:tc>
           <w:tcPr>
-            <w:tcW w:type="dxa" w:w="2880"/>
+            <w:tcW w:type="dxa" w:w="2873"/>
           </w:tcPr>
           <w:p>
             <w:r>
@@ -354,7 +354,7 @@
         </w:tc>
         <w:tc>
           <w:tcPr>
-            <w:tcW w:type="dxa" w:w="2880"/>
+            <w:tcW w:type="dxa" w:w="2873"/>
           </w:tcPr>
           <w:p>
             <w:r>
@@ -683,6 +683,27 @@
     </w:p>
     <w:p>
       <w:pPr>
+        <w:pStyle w:val="ListNumber"/>
+      </w:pPr>
+      <w:r>
+        <w:t>As mensagens sincronizam nos dois sentidos: o que é mandado pelo celular aparece dentro do CRM, na conversa certa. As mensagens que estavam na conversa errada voltaram para o lugar delas — nada foi perdido.</w:t>
+      </w:r>
+    </w:p>
+    <w:p>
+      <w:pPr>
+        <w:pStyle w:val="ListNumber"/>
+      </w:pPr>
+      <w:r>
+        <w:t>Cartão de contato e localização deixaram de sumir — agora aparecem como [contato] e [localização].</w:t>
+      </w:r>
+    </w:p>
+    <w:p>
+      <w:r>
+        <w:t>Se alguma conversa parecer com mensagem faltando, avise — dá para conferir e consertar na hora.</w:t>
+      </w:r>
+    </w:p>
+    <w:p>
+      <w:pPr>
         <w:pStyle w:val="Heading2"/>
       </w:pPr>
       <w:r>
@@ -747,8 +768,8 @@
     </w:p>
     <w:sectPr>
       <w:footerReference w:type="default" r:id="rId9"/>
-      <w:pgSz w:w="12240" w:h="15840"/>
-      <w:pgMar w:top="1440" w:right="1800" w:bottom="1440" w:left="1800" w:header="720" w:footer="720" w:gutter="0"/>
+      <w:pgSz w:w="12246" w:h="15817"/>
+      <w:pgMar w:top="1417" w:right="1814" w:bottom="1417" w:left="1814" w:header="720" w:footer="720" w:gutter="0"/>
       <w:cols w:space="720"/>
       <w:docGrid w:linePitch="360"/>
     </w:sectPr>

</xml_diff>